<commit_message>
feat: Add Windows batch files for server management and update docs
- start_local.bat - Start frontend and backend servers
- stop_local.bat - Stop all servers
- restart_local.bat - Restart servers
- status_local.bat - Check server status
- servers.bat - Interactive menu for server management
- run_tests.bat - Run all tests (frontend + backend)
- Updated documentation with AI providers, testing, and security sections
</commit_message>
<xml_diff>
--- a/Описание функционала.docx
+++ b/Описание функционала.docx
@@ -1957,6 +1957,346 @@
       </w:r>
     </w:p>
     <w:p/>
+    <w:p>
+      <w:r>
+        <w:t>---</w:t>
+      </w:r>
+    </w:p>
+    <w:p>
+      <w:r>
+        <w:t>7. Поддержка AI провайдеров</w:t>
+      </w:r>
+    </w:p>
+    <w:p>
+      <w:r>
+        <w:t>Система поддерживает три AI провайдера для распознавания документов:</w:t>
+      </w:r>
+    </w:p>
+    <w:p>
+      <w:r>
+        <w:t>A. Google Gemini</w:t>
+      </w:r>
+    </w:p>
+    <w:p>
+      <w:r>
+        <w:t>API Key: Требуется ввод ключа при первом запуске или можно использовать ключ из .env файла.</w:t>
+      </w:r>
+    </w:p>
+    <w:p>
+      <w:r>
+        <w:t>Модели:</w:t>
+      </w:r>
+    </w:p>
+    <w:p>
+      <w:r>
+        <w:t>- gemini-2.5-pro (рекомендуется для сложных задач)</w:t>
+      </w:r>
+    </w:p>
+    <w:p>
+      <w:r>
+        <w:t>- gemini-2.0-flash (быстрая обработка)</w:t>
+      </w:r>
+    </w:p>
+    <w:p>
+      <w:r>
+        <w:t>- gemini-1.5-pro (устаревшая, высокая точность)</w:t>
+      </w:r>
+    </w:p>
+    <w:p>
+      <w:r>
+        <w:t>Проверка: Кнопка «Проверить» позволяет проверить доступность ключа и модели.</w:t>
+      </w:r>
+    </w:p>
+    <w:p>
+      <w:r>
+        <w:t>B. OpenRouter</w:t>
+      </w:r>
+    </w:p>
+    <w:p>
+      <w:r>
+        <w:t>API Key: Требуется ввод ключа API ключ при первом запуске или из .env.</w:t>
+      </w:r>
+    </w:p>
+    <w:p>
+      <w:r>
+        <w:t>Модели: Более 200 моделей от различных провайдеров (Anthropic, Meta, Mistral и др.).</w:t>
+      </w:r>
+    </w:p>
+    <w:p>
+      <w:r>
+        <w:t>Бесплатные модели: Отмечены значком ⚡ в списке.</w:t>
+      </w:r>
+    </w:p>
+    <w:p>
+      <w:r>
+        <w:t>Проверка: Кнопка «Проверить» показывает доступность выбранной модели.</w:t>
+      </w:r>
+    </w:p>
+    <w:p>
+      <w:r>
+        <w:t>C. Ollama (Локальный / Облачный)</w:t>
+      </w:r>
+    </w:p>
+    <w:p>
+      <w:r>
+        <w:t>Два режима работы:</w:t>
+      </w:r>
+    </w:p>
+    <w:p>
+      <w:r>
+        <w:t>- Локальный сервер: Подключение к локальному Ollama серверу (http://localhost:11434 по умолчанию).</w:t>
+      </w:r>
+    </w:p>
+    <w:p>
+      <w:r>
+        <w:t>- Ollama Cloud: Облачный сервис Ollama (требуется API ключ).</w:t>
+      </w:r>
+    </w:p>
+    <w:p>
+      <w:r>
+        <w:t>API Key: Обязательно требуется ввод API ключа при выборе Ollama Cloud ( ключ из .env игнорируется из соображений безопасности).</w:t>
+      </w:r>
+    </w:p>
+    <w:p>
+      <w:r>
+        <w:t>Модели: qwen3.5, llama3.2, mistral и др.</w:t>
+      </w:r>
+    </w:p>
+    <w:p>
+      <w:r>
+        <w:t>Проверка: Кнопка «Проверить» проверяет соединение с локальным или облачным сервером.</w:t>
+      </w:r>
+    </w:p>
+    <w:p>
+      <w:r>
+        <w:t>Важно: Для безопасности API ключ Ollama Cloud должен вводиться вручную через настройки интерфейса. Система не использует предустановленные ключи из конфигурационных файлов.</w:t>
+      </w:r>
+    </w:p>
+    <w:p>
+      <w:r>
+        <w:t>---</w:t>
+      </w:r>
+    </w:p>
+    <w:p>
+      <w:r>
+        <w:t>8. Локальная разработка и тестирование</w:t>
+      </w:r>
+    </w:p>
+    <w:p>
+      <w:r>
+        <w:t>A. Управление серверами (bat-файлы)</w:t>
+      </w:r>
+    </w:p>
+    <w:p>
+      <w:r>
+        <w:t>Для удобства разработки созданы командные файлы:</w:t>
+      </w:r>
+    </w:p>
+    <w:p>
+      <w:r>
+        <w:t>start_local.bat — Запуск Frontend (порт 3000) и Backend (порт 8000).</w:t>
+      </w:r>
+    </w:p>
+    <w:p>
+      <w:r>
+        <w:t>stop_local.bat — Остановка всех серверов.</w:t>
+      </w:r>
+    </w:p>
+    <w:p>
+      <w:r>
+        <w:t>restart_local.bat — Перезапуск серверов.</w:t>
+      </w:r>
+    </w:p>
+    <w:p>
+      <w:r>
+        <w:t>status_local.bat — Проверка статуса серверов.</w:t>
+      </w:r>
+    </w:p>
+    <w:p>
+      <w:r>
+        <w:t>servers.bat — Интерактивное меню управления серверами.</w:t>
+      </w:r>
+    </w:p>
+    <w:p>
+      <w:r>
+        <w:t>run_tests.bat — Запуск всех тестов.</w:t>
+      </w:r>
+    </w:p>
+    <w:p>
+      <w:r>
+        <w:t>B. Тестирование (Тесты)</w:t>
+      </w:r>
+    </w:p>
+    <w:p>
+      <w:r>
+        <w:t>Система включает комплекс тестов:</w:t>
+      </w:r>
+    </w:p>
+    <w:p>
+      <w:r>
+        <w:t>Frontend тесты (Vitest, 47 тестов):</w:t>
+      </w:r>
+    </w:p>
+    <w:p>
+      <w:r>
+        <w:t>- Конвертация единиц измерения (ГБ, МБ, ТБ, ГГц, МГц, Вт, кВт)</w:t>
+      </w:r>
+    </w:p>
+    <w:p>
+      <w:r>
+        <w:t>- Нормализация текста</w:t>
+      </w:r>
+    </w:p>
+    <w:p>
+      <w:r>
+        <w:t>- Расчёт схожесть токенов</w:t>
+      </w:r>
+    </w:p>
+    <w:p>
+      <w:r>
+        <w:t>- Парсинг значений характеристик</w:t>
+      </w:r>
+    </w:p>
+    <w:p>
+      <w:r>
+        <w:t>- Валидация ИНН</w:t>
+      </w:r>
+    </w:p>
+    <w:p>
+      <w:r>
+        <w:t>- Форматирование даты/времени</w:t>
+      </w:r>
+    </w:p>
+    <w:p>
+      <w:r>
+        <w:t>Backend тесты (Pytest, 29 тестов):</w:t>
+      </w:r>
+    </w:p>
+    <w:p>
+      <w:r>
+        <w:t>- Валидация Pydantic схем</w:t>
+      </w:r>
+    </w:p>
+    <w:p>
+      <w:r>
+        <w:t>- Проверка API эндпоинтов</w:t>
+      </w:r>
+    </w:p>
+    <w:p>
+      <w:r>
+        <w:t>- Валидация ИНН (10/12 знаков)</w:t>
+      </w:r>
+    </w:p>
+    <w:p>
+      <w:r>
+        <w:t>- Формат строки токенов</w:t>
+      </w:r>
+    </w:p>
+    <w:p>
+      <w:r>
+        <w:t>- Формат кодов КТРУ</w:t>
+      </w:r>
+    </w:p>
+    <w:p>
+      <w:r>
+        <w:t>Запуск тестов:</w:t>
+      </w:r>
+    </w:p>
+    <w:p>
+      <w:r>
+        <w:t>cd old &amp;&amp; npm run test # Frontend тесты</w:t>
+      </w:r>
+    </w:p>
+    <w:p>
+      <w:r>
+        <w:t>cd backend &amp;&amp; python -m pytest test_schemas.py -v # Backend тесты</w:t>
+      </w:r>
+    </w:p>
+    <w:p>
+      <w:r>
+        <w:t>Или используйте run_tests.bat для запуска всех тестов сразу.</w:t>
+      </w:r>
+    </w:p>
+    <w:p>
+      <w:r>
+        <w:t>---</w:t>
+      </w:r>
+    </w:p>
+    <w:p>
+      <w:r>
+        <w:t>9. Безопасность API ключей</w:t>
+      </w:r>
+    </w:p>
+    <w:p>
+      <w:r>
+        <w:t>Система реализует безопасное хранение API ключей:</w:t>
+      </w:r>
+    </w:p>
+    <w:p>
+      <w:r>
+        <w:t>A. Google Gemini и OpenRouter</w:t>
+      </w:r>
+    </w:p>
+    <w:p>
+      <w:r>
+        <w:t>- Ключи могут храниться в .env файле (VITE_GEMINI_API_KEY, VITE_OPENROUTER_API_KEY)</w:t>
+      </w:r>
+    </w:p>
+    <w:p>
+      <w:r>
+        <w:t>- Или вводиться вручную через настройки интерфейса</w:t>
+      </w:r>
+    </w:p>
+    <w:p>
+      <w:r>
+        <w:t>- При наличии ключа в .env отображается маска ключа (..XXXX)</w:t>
+      </w:r>
+    </w:p>
+    <w:p>
+      <w:r>
+        <w:t>- Переключатель «Из .env» / «API ключ» позволяет выбрать источник</w:t>
+      </w:r>
+    </w:p>
+    <w:p>
+      <w:r>
+        <w:t>B. Ollama Cloud</w:t>
+      </w:r>
+    </w:p>
+    <w:p>
+      <w:r>
+        <w:t>- Ключи из .env файла НЕ используются из соображений безопасности</w:t>
+      </w:r>
+    </w:p>
+    <w:p>
+      <w:r>
+        <w:t>- Ключ должен вводиться вручную при каждом новом сеансе</w:t>
+      </w:r>
+    </w:p>
+    <w:p>
+      <w:r>
+        <w:t>- Это предотвращает несанкционированное использование вашего API ключа третьими лицами</w:t>
+      </w:r>
+    </w:p>
+    <w:p>
+      <w:r>
+        <w:t>C. Хранение ключей</w:t>
+      </w:r>
+    </w:p>
+    <w:p>
+      <w:r>
+        <w:t>- Ключи сохраняются в локальном хранилище браузера (IndexedDB)</w:t>
+      </w:r>
+    </w:p>
+    <w:p>
+      <w:r>
+        <w:t>- Не передаются на сервер без необходимости выполнения запроса</w:t>
+      </w:r>
+    </w:p>
+    <w:p>
+      <w:r>
+        <w:t>- Маскируются при отображении в интерфейсе</w:t>
+      </w:r>
+    </w:p>
     <w:sectPr>
       <w:pgSz w:w="11906" w:h="16838"/>
       <w:pgMar w:top="1134" w:right="850" w:bottom="1134" w:left="1701" w:header="708" w:footer="708" w:gutter="0"/>

</xml_diff>